<commit_message>
added Clement's signature to minutes
</commit_message>
<xml_diff>
--- a/Meeting Minutes/Advisor meetings/Clement Meeting Minutes 14-09.docx
+++ b/Meeting Minutes/Advisor meetings/Clement Meeting Minutes 14-09.docx
@@ -1605,6 +1605,17 @@
           <w:p>
             <w:r>
               <w:t xml:space="preserve">Signature: </w:t>
+            </w:r>
+            <w:r>
+              <w:t xml:space="preserve">Clement </w:t>
+            </w:r>
+            <w:proofErr w:type="spellStart"/>
+            <w:r>
+              <w:t>Swarnappa</w:t>
+            </w:r>
+            <w:proofErr w:type="spellEnd"/>
+            <w:r>
+              <w:t xml:space="preserve"> 16/09/26</w:t>
             </w:r>
           </w:p>
         </w:tc>

</xml_diff>